<commit_message>
Update Proposal Final Project.docx
</commit_message>
<xml_diff>
--- a/Proposal Final Project.docx
+++ b/Proposal Final Project.docx
@@ -212,6 +212,17 @@
     <w:p>
       <w:r>
         <w:t>Braeden Olds</w:t>
+      </w:r>
+    </w:p>
+    <w:p/>
+    <w:p>
+      <w:r>
+        <w:t>Contact</w:t>
+      </w:r>
+    </w:p>
+    <w:p>
+      <w:r>
+        <w:t>Name</w:t>
       </w:r>
     </w:p>
     <w:sectPr>

</xml_diff>